<commit_message>
fidelity-norm/3.5.0: regenerated locks, vectors, fixtures and Chrome's recording
Generated by the steps of the change record, nothing edited by hand: zone-a/scripts/lock_versions.py,
generate_qrd_registry.py, check_labels.py, certified_word_fixtures.py and word_fixtures.py record
(the QRD template's narratives change; the five Word SmPCs' recording is byte for byte the same);
npm run contracts:generate, vectors:generate (verify 187 -> 189, every other vector moving only in
its version and report hash), contracts:fixtures, contracts:quote-edge, differential:smoke,
authority:vectors, certified-word:vectors, authority:lock (2.4.4) and certified-word:lock (1.3.2).

Co-Authored-By: Claude Opus 5.5 <noreply@anthropic.com>
</commit_message>
<xml_diff>
--- a/test/fixtures/certified-word/recompute/smpc-refused.docx
+++ b/test/fixtures/certified-word/recompute/smpc-refused.docx
@@ -115,7 +115,9 @@
       <w:r>
         <w:t xml:space="preserve">Dose</w:t>
         <w:tab/>
-        <w:t xml:space="preserve">1 tablet, not for clinical use.</w:t>
+        <w:t xml:space="preserve">1 tablet</w:t>
+        <w:tab/>
+        <w:t xml:space="preserve">daily, not for clinical use.</w:t>
       </w:r>
     </w:p>
     <w:p>

</xml_diff>